<commit_message>
fix chatbot. add knowledge base and chat history
</commit_message>
<xml_diff>
--- a/ai-service/faq.docx
+++ b/ai-service/faq.docx
@@ -705,6 +705,34 @@
           </w:p>
         </w:tc>
       </w:tr>
+      <w:tr>
+        <w:tc>
+          <w:tcPr>
+            <w:tcW w:w="4508" w:type="dxa"/>
+          </w:tcPr>
+          <w:p/>
+        </w:tc>
+        <w:tc>
+          <w:tcPr>
+            <w:tcW w:w="4508" w:type="dxa"/>
+          </w:tcPr>
+          <w:p/>
+        </w:tc>
+      </w:tr>
+      <w:tr>
+        <w:tc>
+          <w:tcPr>
+            <w:tcW w:w="4508" w:type="dxa"/>
+          </w:tcPr>
+          <w:p/>
+        </w:tc>
+        <w:tc>
+          <w:tcPr>
+            <w:tcW w:w="4508" w:type="dxa"/>
+          </w:tcPr>
+          <w:p/>
+        </w:tc>
+      </w:tr>
     </w:tbl>
     <w:p/>
     <w:p/>
@@ -881,6 +909,20 @@
           </w:p>
         </w:tc>
       </w:tr>
+      <w:tr>
+        <w:tc>
+          <w:tcPr>
+            <w:tcW w:w="4508" w:type="dxa"/>
+          </w:tcPr>
+          <w:p/>
+        </w:tc>
+        <w:tc>
+          <w:tcPr>
+            <w:tcW w:w="4508" w:type="dxa"/>
+          </w:tcPr>
+          <w:p/>
+        </w:tc>
+      </w:tr>
     </w:tbl>
     <w:p/>
     <w:p/>
@@ -1303,42 +1345,6 @@
         <w:gridCol w:w="4508"/>
         <w:gridCol w:w="4508"/>
       </w:tblGrid>
-      <w:tr>
-        <w:tc>
-          <w:tcPr>
-            <w:tcW w:w="4508" w:type="dxa"/>
-          </w:tcPr>
-          <w:p>
-            <w:pPr>
-              <w:jc w:val="center"/>
-            </w:pPr>
-            <w:r>
-              <w:rPr>
-                <w:b/>
-                <w:bCs/>
-              </w:rPr>
-              <w:t>Pertanyaan</w:t>
-            </w:r>
-          </w:p>
-        </w:tc>
-        <w:tc>
-          <w:tcPr>
-            <w:tcW w:w="4508" w:type="dxa"/>
-          </w:tcPr>
-          <w:p>
-            <w:pPr>
-              <w:jc w:val="center"/>
-            </w:pPr>
-            <w:r>
-              <w:rPr>
-                <w:b/>
-                <w:bCs/>
-              </w:rPr>
-              <w:t>Jawaban</w:t>
-            </w:r>
-          </w:p>
-        </w:tc>
-      </w:tr>
       <w:tr>
         <w:tc>
           <w:tcPr>

</xml_diff>

<commit_message>
add chatbot. fix retrieval, chunking
</commit_message>
<xml_diff>
--- a/ai-service/faq.docx
+++ b/ai-service/faq.docx
@@ -82,29 +82,8 @@
           </w:tcPr>
           <w:p>
             <w:r>
-              <w:t xml:space="preserve">Informasi terbaru mengenai PMB STMIK Bandung dapat Anda </w:t>
-            </w:r>
-            <w:proofErr w:type="spellStart"/>
-            <w:r>
-              <w:t>peroleh</w:t>
-            </w:r>
-            <w:proofErr w:type="spellEnd"/>
-            <w:r>
-              <w:t xml:space="preserve"> melalui </w:t>
-            </w:r>
-            <w:proofErr w:type="spellStart"/>
-            <w:r>
-              <w:t>website</w:t>
-            </w:r>
-            <w:proofErr w:type="spellEnd"/>
-            <w:r>
-              <w:t xml:space="preserve"> PMB STMIK Bandung, media sosial </w:t>
-            </w:r>
-            <w:proofErr w:type="spellStart"/>
-            <w:r>
-              <w:t>instagram</w:t>
-            </w:r>
-            <w:proofErr w:type="spellEnd"/>
+              <w:t>Informasi terbaru mengenai PMB STMIK Bandung dapat Anda peroleh melalui website PMB STMIK Bandung, media sosial instagram</w:t>
+            </w:r>
           </w:p>
         </w:tc>
       </w:tr>
@@ -125,15 +104,7 @@
           </w:tcPr>
           <w:p>
             <w:r>
-              <w:t xml:space="preserve">STMIK Bandung memiliki 1 kampus, yaitu: Kampus 1: Jl. </w:t>
-            </w:r>
-            <w:proofErr w:type="spellStart"/>
-            <w:r>
-              <w:t>Cikutra</w:t>
-            </w:r>
-            <w:proofErr w:type="spellEnd"/>
-            <w:r>
-              <w:t xml:space="preserve"> No.113, Bandung Kota Bandung, Jawa Barat 40124</w:t>
+              <w:t>STMIK Bandung memiliki 1 kampus, yaitu: Kampus 1: Jl. Cikutra No.113, Bandung Kota Bandung, Jawa Barat 40124</w:t>
             </w:r>
           </w:p>
         </w:tc>
@@ -167,15 +138,7 @@
               </w:numPr>
             </w:pPr>
             <w:r>
-              <w:t xml:space="preserve">Ruang kelas yang nyaman dan </w:t>
-            </w:r>
-            <w:proofErr w:type="spellStart"/>
-            <w:r>
-              <w:t>ber</w:t>
-            </w:r>
-            <w:proofErr w:type="spellEnd"/>
-            <w:r>
-              <w:t>-AC</w:t>
+              <w:t>Ruang kelas yang nyaman dan ber-AC</w:t>
             </w:r>
           </w:p>
           <w:p>
@@ -246,11 +209,9 @@
                 <w:numId w:val="1"/>
               </w:numPr>
             </w:pPr>
-            <w:proofErr w:type="spellStart"/>
             <w:r>
               <w:t>Mushola</w:t>
             </w:r>
-            <w:proofErr w:type="spellEnd"/>
           </w:p>
         </w:tc>
       </w:tr>
@@ -353,15 +314,7 @@
               </w:numPr>
             </w:pPr>
             <w:r>
-              <w:t xml:space="preserve">Network </w:t>
-            </w:r>
-            <w:proofErr w:type="spellStart"/>
-            <w:r>
-              <w:t>engineer</w:t>
-            </w:r>
-            <w:proofErr w:type="spellEnd"/>
-            <w:r>
-              <w:t xml:space="preserve"> </w:t>
+              <w:t xml:space="preserve">Network engineer </w:t>
             </w:r>
           </w:p>
           <w:p>
@@ -372,13 +325,8 @@
                 <w:numId w:val="3"/>
               </w:numPr>
             </w:pPr>
-            <w:proofErr w:type="spellStart"/>
-            <w:r>
-              <w:t>Database</w:t>
-            </w:r>
-            <w:proofErr w:type="spellEnd"/>
-            <w:r>
-              <w:t xml:space="preserve"> administrator </w:t>
+            <w:r>
+              <w:t xml:space="preserve">Database administrator </w:t>
             </w:r>
           </w:p>
           <w:p>
@@ -390,15 +338,7 @@
               </w:numPr>
             </w:pPr>
             <w:r>
-              <w:t xml:space="preserve">IT </w:t>
-            </w:r>
-            <w:proofErr w:type="spellStart"/>
-            <w:r>
-              <w:t>consultant</w:t>
-            </w:r>
-            <w:proofErr w:type="spellEnd"/>
-            <w:r>
-              <w:t xml:space="preserve"> </w:t>
+              <w:t xml:space="preserve">IT consultant </w:t>
             </w:r>
           </w:p>
           <w:p>
@@ -410,13 +350,8 @@
               </w:numPr>
             </w:pPr>
             <w:r>
-              <w:t xml:space="preserve">System </w:t>
-            </w:r>
-            <w:proofErr w:type="spellStart"/>
-            <w:r>
-              <w:t>analyst</w:t>
-            </w:r>
-            <w:proofErr w:type="spellEnd"/>
+              <w:t>System analyst</w:t>
+            </w:r>
           </w:p>
         </w:tc>
       </w:tr>
@@ -682,15 +617,7 @@
           </w:tcPr>
           <w:p>
             <w:r>
-              <w:t xml:space="preserve">Apakah ada biaya tambahan selain yang tercantum di </w:t>
-            </w:r>
-            <w:proofErr w:type="spellStart"/>
-            <w:r>
-              <w:t>website</w:t>
-            </w:r>
-            <w:proofErr w:type="spellEnd"/>
-            <w:r>
-              <w:t>?</w:t>
+              <w:t>Apakah ada biaya tambahan selain yang tercantum di website?</w:t>
             </w:r>
           </w:p>
         </w:tc>
@@ -703,34 +630,6 @@
               <w:t>Komponen biaya utama telah dicantumkan secara transparan. Informasi biaya lainnya akan disampaikan sesuai kebutuhan akademik mahasiswa.</w:t>
             </w:r>
           </w:p>
-        </w:tc>
-      </w:tr>
-      <w:tr>
-        <w:tc>
-          <w:tcPr>
-            <w:tcW w:w="4508" w:type="dxa"/>
-          </w:tcPr>
-          <w:p/>
-        </w:tc>
-        <w:tc>
-          <w:tcPr>
-            <w:tcW w:w="4508" w:type="dxa"/>
-          </w:tcPr>
-          <w:p/>
-        </w:tc>
-      </w:tr>
-      <w:tr>
-        <w:tc>
-          <w:tcPr>
-            <w:tcW w:w="4508" w:type="dxa"/>
-          </w:tcPr>
-          <w:p/>
-        </w:tc>
-        <w:tc>
-          <w:tcPr>
-            <w:tcW w:w="4508" w:type="dxa"/>
-          </w:tcPr>
-          <w:p/>
         </w:tc>
       </w:tr>
     </w:tbl>
@@ -888,39 +787,9 @@
           </w:tcPr>
           <w:p>
             <w:r>
-              <w:t xml:space="preserve">Ya, tersedia berbagai organisasi dan kegiatan kemahasiswaan untuk mengembangkan </w:t>
-            </w:r>
-            <w:proofErr w:type="spellStart"/>
-            <w:r>
-              <w:t>soft</w:t>
-            </w:r>
-            <w:proofErr w:type="spellEnd"/>
-            <w:r>
-              <w:t xml:space="preserve"> </w:t>
-            </w:r>
-            <w:proofErr w:type="spellStart"/>
-            <w:r>
-              <w:t>skill</w:t>
-            </w:r>
-            <w:proofErr w:type="spellEnd"/>
-            <w:r>
-              <w:t xml:space="preserve"> mahasiswa.</w:t>
-            </w:r>
-          </w:p>
-        </w:tc>
-      </w:tr>
-      <w:tr>
-        <w:tc>
-          <w:tcPr>
-            <w:tcW w:w="4508" w:type="dxa"/>
-          </w:tcPr>
-          <w:p/>
-        </w:tc>
-        <w:tc>
-          <w:tcPr>
-            <w:tcW w:w="4508" w:type="dxa"/>
-          </w:tcPr>
-          <w:p/>
+              <w:t>Ya, tersedia berbagai organisasi dan kegiatan kemahasiswaan untuk mengembangkan soft skill mahasiswa.</w:t>
+            </w:r>
+          </w:p>
         </w:tc>
       </w:tr>
     </w:tbl>
@@ -1087,15 +956,7 @@
               </w:numPr>
             </w:pPr>
             <w:r>
-              <w:t xml:space="preserve">No. Telepon / </w:t>
-            </w:r>
-            <w:proofErr w:type="spellStart"/>
-            <w:r>
-              <w:t>WhatsApp</w:t>
-            </w:r>
-            <w:proofErr w:type="spellEnd"/>
-            <w:r>
-              <w:t xml:space="preserve"> (Yang Bisa Dihubungi). </w:t>
+              <w:t xml:space="preserve">No. Telepon / WhatsApp (Yang Bisa Dihubungi). </w:t>
             </w:r>
           </w:p>
           <w:p>
@@ -1134,15 +995,7 @@
               </w:numPr>
             </w:pPr>
             <w:r>
-              <w:t xml:space="preserve">Jalur </w:t>
-            </w:r>
-            <w:proofErr w:type="spellStart"/>
-            <w:r>
-              <w:t>Regular</w:t>
-            </w:r>
-            <w:proofErr w:type="spellEnd"/>
-            <w:r>
-              <w:t xml:space="preserve"> </w:t>
+              <w:t xml:space="preserve">Jalur Regular </w:t>
             </w:r>
           </w:p>
           <w:p>
@@ -1166,23 +1019,7 @@
               </w:numPr>
             </w:pPr>
             <w:r>
-              <w:t xml:space="preserve">Jalur Beasiswa (Akademik, Non Akademik, </w:t>
-            </w:r>
-            <w:proofErr w:type="spellStart"/>
-            <w:r>
-              <w:t>Tahfiz</w:t>
-            </w:r>
-            <w:proofErr w:type="spellEnd"/>
-            <w:r>
-              <w:t xml:space="preserve"> </w:t>
-            </w:r>
-            <w:proofErr w:type="spellStart"/>
-            <w:r>
-              <w:t>Qur'an</w:t>
-            </w:r>
-            <w:proofErr w:type="spellEnd"/>
-            <w:r>
-              <w:t>, Organisasi, Kejuaraan Kab/Kota, Provinsi)</w:t>
+              <w:t>Jalur Beasiswa (Akademik, Non Akademik, Tahfiz Qur'an, Organisasi, Kejuaraan Kab/Kota, Provinsi)</w:t>
             </w:r>
           </w:p>
         </w:tc>
@@ -1216,15 +1053,7 @@
               </w:numPr>
             </w:pPr>
             <w:r>
-              <w:t xml:space="preserve">Melampirkan Ijazah dan Transkrip Nilai atau </w:t>
-            </w:r>
-            <w:proofErr w:type="spellStart"/>
-            <w:r>
-              <w:t>Rapot</w:t>
-            </w:r>
-            <w:proofErr w:type="spellEnd"/>
-            <w:r>
-              <w:t xml:space="preserve"> kelas </w:t>
+              <w:t xml:space="preserve">Melampirkan Ijazah dan Transkrip Nilai atau Rapot kelas </w:t>
             </w:r>
           </w:p>
           <w:p>

</xml_diff>